<commit_message>
оработал корзину, создал пару не существующих ранее страниц, пофиксил баги. азделил cart на страницы, подробнее: modified:   .idea/.name         modified:   checkout.php         deleted:    pages/Olddcart.php         modified:   pages/cart/CartController.php         modified:   pages/cart/CartHelper.php         modified:   pages/cart/GuestCartService.php         modified:   pages/cart/cart.css         modified:   pages/cart/cart.js         modified:   pages/cart/cart_view.php         modified:   pages/compare.php         modified:   pages/wishlist.php         modified:   project_structure.txt         new file:   reorder.php
</commit_message>
<xml_diff>
--- a/Памятка по виртуальному окружению.docx
+++ b/Памятка по виртуальному окружению.docx
@@ -69,12 +69,14 @@
       <w:r>
         <w:t>.</w:t>
       </w:r>
+      <w:proofErr w:type="spellStart"/>
       <w:r>
         <w:rPr>
           <w:lang w:val="en-US"/>
         </w:rPr>
         <w:t>py</w:t>
       </w:r>
+      <w:proofErr w:type="spellEnd"/>
     </w:p>
     <w:p>
       <w:r>
@@ -136,6 +138,7 @@
     <w:p/>
     <w:p>
       <w:pPr>
+        <w:spacing w:after="0"/>
         <w:rPr>
           <w:lang w:val="en-US"/>
         </w:rPr>
@@ -144,18 +147,82 @@
         <w:rPr>
           <w:lang w:val="en-US"/>
         </w:rPr>
-        <w:t>$exclude = "venv","vendor",".git","__pycache__"</w:t>
+        <w:t>$exclude = "</w:t>
+      </w:r>
+      <w:proofErr w:type="spellStart"/>
+      <w:r>
+        <w:rPr>
+          <w:lang w:val="en-US"/>
+        </w:rPr>
+        <w:t>venv</w:t>
+      </w:r>
+      <w:proofErr w:type="spellEnd"/>
+      <w:r>
+        <w:rPr>
+          <w:lang w:val="en-US"/>
+        </w:rPr>
+        <w:t>","vendor",</w:t>
+      </w:r>
+      <w:proofErr w:type="gramStart"/>
+      <w:r>
+        <w:rPr>
+          <w:lang w:val="en-US"/>
+        </w:rPr>
+        <w:t>".git</w:t>
+      </w:r>
+      <w:proofErr w:type="gramEnd"/>
+      <w:r>
+        <w:rPr>
+          <w:lang w:val="en-US"/>
+        </w:rPr>
+        <w:t>","__</w:t>
+      </w:r>
+      <w:proofErr w:type="spellStart"/>
+      <w:r>
+        <w:rPr>
+          <w:lang w:val="en-US"/>
+        </w:rPr>
+        <w:t>pycache</w:t>
+      </w:r>
+      <w:proofErr w:type="spellEnd"/>
+      <w:r>
+        <w:rPr>
+          <w:lang w:val="en-US"/>
+        </w:rPr>
+        <w:t>__"</w:t>
       </w:r>
     </w:p>
     <w:p>
       <w:pPr>
+        <w:spacing w:after="0"/>
         <w:rPr>
           <w:lang w:val="en-US"/>
         </w:rPr>
       </w:pPr>
+      <w:r>
+        <w:rPr>
+          <w:lang w:val="en-US"/>
+        </w:rPr>
+        <w:t>function Show-</w:t>
+      </w:r>
+      <w:proofErr w:type="gramStart"/>
+      <w:r>
+        <w:rPr>
+          <w:lang w:val="en-US"/>
+        </w:rPr>
+        <w:t>Tree(</w:t>
+      </w:r>
+      <w:proofErr w:type="gramEnd"/>
+      <w:r>
+        <w:rPr>
+          <w:lang w:val="en-US"/>
+        </w:rPr>
+        <w:t>$path, $indent="") {</w:t>
+      </w:r>
     </w:p>
     <w:p>
       <w:pPr>
+        <w:spacing w:after="0"/>
         <w:rPr>
           <w:lang w:val="en-US"/>
         </w:rPr>
@@ -164,11 +231,82 @@
         <w:rPr>
           <w:lang w:val="en-US"/>
         </w:rPr>
-        <w:t>function Show-Tree($path, $indent="") {</w:t>
+        <w:t xml:space="preserve">    Get-</w:t>
+      </w:r>
+      <w:proofErr w:type="spellStart"/>
+      <w:r>
+        <w:rPr>
+          <w:lang w:val="en-US"/>
+        </w:rPr>
+        <w:t>ChildItem</w:t>
+      </w:r>
+      <w:proofErr w:type="spellEnd"/>
+      <w:r>
+        <w:rPr>
+          <w:lang w:val="en-US"/>
+        </w:rPr>
+        <w:t xml:space="preserve"> $path | Where-Object </w:t>
+      </w:r>
+      <w:proofErr w:type="gramStart"/>
+      <w:r>
+        <w:rPr>
+          <w:lang w:val="en-US"/>
+        </w:rPr>
+        <w:t>{ $</w:t>
+      </w:r>
+      <w:proofErr w:type="gramEnd"/>
+      <w:r>
+        <w:rPr>
+          <w:lang w:val="en-US"/>
+        </w:rPr>
+        <w:t>exclude -</w:t>
+      </w:r>
+      <w:proofErr w:type="spellStart"/>
+      <w:r>
+        <w:rPr>
+          <w:lang w:val="en-US"/>
+        </w:rPr>
+        <w:t>notcontains</w:t>
+      </w:r>
+      <w:proofErr w:type="spellEnd"/>
+      <w:r>
+        <w:rPr>
+          <w:lang w:val="en-US"/>
+        </w:rPr>
+        <w:t xml:space="preserve"> $</w:t>
+      </w:r>
+      <w:proofErr w:type="gramStart"/>
+      <w:r>
+        <w:rPr>
+          <w:lang w:val="en-US"/>
+        </w:rPr>
+        <w:t>_.Name</w:t>
+      </w:r>
+      <w:proofErr w:type="gramEnd"/>
+      <w:r>
+        <w:rPr>
+          <w:lang w:val="en-US"/>
+        </w:rPr>
+        <w:t xml:space="preserve"> } | </w:t>
+      </w:r>
+      <w:proofErr w:type="spellStart"/>
+      <w:r>
+        <w:rPr>
+          <w:lang w:val="en-US"/>
+        </w:rPr>
+        <w:t>ForEach</w:t>
+      </w:r>
+      <w:proofErr w:type="spellEnd"/>
+      <w:r>
+        <w:rPr>
+          <w:lang w:val="en-US"/>
+        </w:rPr>
+        <w:t>-Object {</w:t>
       </w:r>
     </w:p>
     <w:p>
       <w:pPr>
+        <w:spacing w:after="0"/>
         <w:rPr>
           <w:lang w:val="en-US"/>
         </w:rPr>
@@ -177,11 +315,26 @@
         <w:rPr>
           <w:lang w:val="en-US"/>
         </w:rPr>
-        <w:t xml:space="preserve">    Get-ChildItem $path | Where-Object { $exclude -notcontains $_.Name } | ForEach-Object {</w:t>
+        <w:t xml:space="preserve">        "$indent├── $($</w:t>
+      </w:r>
+      <w:proofErr w:type="gramStart"/>
+      <w:r>
+        <w:rPr>
+          <w:lang w:val="en-US"/>
+        </w:rPr>
+        <w:t>_.Name</w:t>
+      </w:r>
+      <w:proofErr w:type="gramEnd"/>
+      <w:r>
+        <w:rPr>
+          <w:lang w:val="en-US"/>
+        </w:rPr>
+        <w:t>)"</w:t>
       </w:r>
     </w:p>
     <w:p>
       <w:pPr>
+        <w:spacing w:after="0"/>
         <w:rPr>
           <w:lang w:val="en-US"/>
         </w:rPr>
@@ -190,11 +343,34 @@
         <w:rPr>
           <w:lang w:val="en-US"/>
         </w:rPr>
-        <w:t xml:space="preserve">        "$indent├── $($_.Name)"</w:t>
+        <w:t xml:space="preserve">        if ($</w:t>
+      </w:r>
+      <w:proofErr w:type="gramStart"/>
+      <w:r>
+        <w:rPr>
+          <w:lang w:val="en-US"/>
+        </w:rPr>
+        <w:t>_.</w:t>
+      </w:r>
+      <w:proofErr w:type="spellStart"/>
+      <w:r>
+        <w:rPr>
+          <w:lang w:val="en-US"/>
+        </w:rPr>
+        <w:t>PSIsContainer</w:t>
+      </w:r>
+      <w:proofErr w:type="spellEnd"/>
+      <w:proofErr w:type="gramEnd"/>
+      <w:r>
+        <w:rPr>
+          <w:lang w:val="en-US"/>
+        </w:rPr>
+        <w:t>) {</w:t>
       </w:r>
     </w:p>
     <w:p>
       <w:pPr>
+        <w:spacing w:after="0"/>
         <w:rPr>
           <w:lang w:val="en-US"/>
         </w:rPr>
@@ -203,11 +379,34 @@
         <w:rPr>
           <w:lang w:val="en-US"/>
         </w:rPr>
-        <w:t xml:space="preserve">        if ($_.PSIsContainer) {</w:t>
+        <w:t xml:space="preserve">            Show-Tree $</w:t>
+      </w:r>
+      <w:proofErr w:type="gramStart"/>
+      <w:r>
+        <w:rPr>
+          <w:lang w:val="en-US"/>
+        </w:rPr>
+        <w:t>_.</w:t>
+      </w:r>
+      <w:proofErr w:type="spellStart"/>
+      <w:r>
+        <w:rPr>
+          <w:lang w:val="en-US"/>
+        </w:rPr>
+        <w:t>FullName</w:t>
+      </w:r>
+      <w:proofErr w:type="spellEnd"/>
+      <w:proofErr w:type="gramEnd"/>
+      <w:r>
+        <w:rPr>
+          <w:lang w:val="en-US"/>
+        </w:rPr>
+        <w:t xml:space="preserve"> "$indent│   "</w:t>
       </w:r>
     </w:p>
     <w:p>
       <w:pPr>
+        <w:spacing w:after="0"/>
         <w:rPr>
           <w:lang w:val="en-US"/>
         </w:rPr>
@@ -216,11 +415,12 @@
         <w:rPr>
           <w:lang w:val="en-US"/>
         </w:rPr>
-        <w:t xml:space="preserve">            Show-Tree $_.FullName "$indent│   "</w:t>
+        <w:t xml:space="preserve">        }</w:t>
       </w:r>
     </w:p>
     <w:p>
       <w:pPr>
+        <w:spacing w:after="0"/>
         <w:rPr>
           <w:lang w:val="en-US"/>
         </w:rPr>
@@ -229,11 +429,12 @@
         <w:rPr>
           <w:lang w:val="en-US"/>
         </w:rPr>
-        <w:t xml:space="preserve">        }</w:t>
+        <w:t xml:space="preserve">    }</w:t>
       </w:r>
     </w:p>
     <w:p>
       <w:pPr>
+        <w:spacing w:after="0"/>
         <w:rPr>
           <w:lang w:val="en-US"/>
         </w:rPr>
@@ -242,11 +443,12 @@
         <w:rPr>
           <w:lang w:val="en-US"/>
         </w:rPr>
-        <w:t xml:space="preserve">    }</w:t>
+        <w:t>}</w:t>
       </w:r>
     </w:p>
     <w:p>
       <w:pPr>
+        <w:spacing w:after="0"/>
         <w:rPr>
           <w:lang w:val="en-US"/>
         </w:rPr>
@@ -255,82 +457,77 @@
         <w:rPr>
           <w:lang w:val="en-US"/>
         </w:rPr>
+        <w:t>"</w:t>
+      </w:r>
+      <w:proofErr w:type="spellStart"/>
+      <w:r>
+        <w:rPr>
+          <w:lang w:val="en-US"/>
+        </w:rPr>
+        <w:t>mobileshop</w:t>
+      </w:r>
+      <w:proofErr w:type="spellEnd"/>
+      <w:r>
+        <w:rPr>
+          <w:lang w:val="en-US"/>
+        </w:rPr>
+        <w:t>" | Out-File project_structure.txt</w:t>
+      </w:r>
+    </w:p>
+    <w:p>
+      <w:pPr>
+        <w:spacing w:after="0"/>
+        <w:rPr>
+          <w:lang w:val="en-US"/>
+        </w:rPr>
+      </w:pPr>
+      <w:r>
+        <w:rPr>
+          <w:lang w:val="en-US"/>
+        </w:rPr>
+        <w:t xml:space="preserve">Show-Tree "." | Out-File project_structure.txt </w:t>
+      </w:r>
+      <w:r>
+        <w:rPr>
+          <w:lang w:val="en-US"/>
+        </w:rPr>
+        <w:t>–</w:t>
+      </w:r>
+      <w:r>
+        <w:rPr>
+          <w:lang w:val="en-US"/>
+        </w:rPr>
+        <w:t>Append</w:t>
+      </w:r>
+      <w:r>
+        <w:rPr>
+          <w:lang w:val="en-US"/>
+        </w:rPr>
+        <w:br/>
+      </w:r>
+      <w:r>
+        <w:rPr>
+          <w:lang w:val="en-US"/>
+        </w:rPr>
+        <w:br/>
+      </w:r>
+      <w:r>
+        <w:rPr>
+          <w:lang w:val="en-US"/>
+        </w:rPr>
+        <w:br/>
+      </w:r>
+      <w:r>
+        <w:rPr>
+          <w:lang w:val="en-US"/>
+        </w:rPr>
+        <w:br/>
+      </w:r>
+      <w:r>
+        <w:rPr>
+          <w:lang w:val="en-US"/>
+        </w:rPr>
         <w:lastRenderedPageBreak/>
-        <w:t>}</w:t>
-      </w:r>
-    </w:p>
-    <w:p>
-      <w:pPr>
-        <w:rPr>
-          <w:lang w:val="en-US"/>
-        </w:rPr>
-      </w:pPr>
-    </w:p>
-    <w:p>
-      <w:pPr>
-        <w:rPr>
-          <w:lang w:val="en-US"/>
-        </w:rPr>
-      </w:pPr>
-      <w:r>
-        <w:rPr>
-          <w:lang w:val="en-US"/>
-        </w:rPr>
-        <w:t>"mobileshop" | Out-File project_structure.txt</w:t>
-      </w:r>
-    </w:p>
-    <w:p>
-      <w:pPr>
-        <w:rPr>
-          <w:lang w:val="en-US"/>
-        </w:rPr>
-      </w:pPr>
-      <w:r>
-        <w:rPr>
-          <w:lang w:val="en-US"/>
-        </w:rPr>
-        <w:t xml:space="preserve">Show-Tree "." | Out-File project_structure.txt </w:t>
-      </w:r>
-      <w:r>
-        <w:rPr>
-          <w:lang w:val="en-US"/>
-        </w:rPr>
-        <w:t>–</w:t>
-      </w:r>
-      <w:r>
-        <w:rPr>
-          <w:lang w:val="en-US"/>
-        </w:rPr>
-        <w:t>Append</w:t>
-      </w:r>
-      <w:r>
-        <w:rPr>
-          <w:lang w:val="en-US"/>
-        </w:rPr>
-        <w:br/>
-      </w:r>
-      <w:r>
-        <w:rPr>
-          <w:lang w:val="en-US"/>
-        </w:rPr>
-        <w:br/>
-      </w:r>
-      <w:r>
-        <w:rPr>
-          <w:lang w:val="en-US"/>
-        </w:rPr>
-        <w:br/>
-      </w:r>
-      <w:r>
-        <w:rPr>
-          <w:lang w:val="en-US"/>
-        </w:rPr>
-        <w:br/>
-      </w:r>
-      <w:r>
-        <w:rPr>
-          <w:lang w:val="en-US"/>
-        </w:rPr>
         <w:br/>
       </w:r>
       <w:r>
@@ -362,19 +559,49 @@
         <w:rPr>
           <w:lang w:val="en-US"/>
         </w:rPr>
-        <w:t>[22.03.2026 10:57] Дима Мельников: cd C:\xampp\htdocs\mobileshop\test_bot</w:t>
+        <w:t xml:space="preserve">[22.03.2026 10:57] </w:t>
+      </w:r>
+      <w:proofErr w:type="spellStart"/>
+      <w:r>
+        <w:rPr>
+          <w:lang w:val="en-US"/>
+        </w:rPr>
+        <w:t>Дима</w:t>
+      </w:r>
+      <w:proofErr w:type="spellEnd"/>
+      <w:r>
+        <w:rPr>
+          <w:lang w:val="en-US"/>
+        </w:rPr>
+        <w:t xml:space="preserve"> </w:t>
+      </w:r>
+      <w:proofErr w:type="spellStart"/>
+      <w:r>
+        <w:rPr>
+          <w:lang w:val="en-US"/>
+        </w:rPr>
+        <w:t>Мельников</w:t>
+      </w:r>
+      <w:proofErr w:type="spellEnd"/>
+      <w:r>
+        <w:rPr>
+          <w:lang w:val="en-US"/>
+        </w:rPr>
+        <w:t>: cd C:\xampp\htdocs\mobileshop\test_bot</w:t>
       </w:r>
     </w:p>
     <w:p>
       <w:r>
         <w:t xml:space="preserve">[22.03.2026 10:58] Дима Мельников: # Удалите старую папку </w:t>
       </w:r>
+      <w:proofErr w:type="spellStart"/>
       <w:r>
         <w:rPr>
           <w:lang w:val="en-US"/>
         </w:rPr>
         <w:t>venv</w:t>
       </w:r>
+      <w:proofErr w:type="spellEnd"/>
     </w:p>
     <w:p>
       <w:r>
@@ -413,12 +640,14 @@
       <w:r>
         <w:t xml:space="preserve"> </w:t>
       </w:r>
+      <w:proofErr w:type="spellStart"/>
       <w:r>
         <w:rPr>
           <w:lang w:val="en-US"/>
         </w:rPr>
         <w:t>venv</w:t>
       </w:r>
+      <w:proofErr w:type="spellEnd"/>
     </w:p>
     <w:p/>
     <w:p>
@@ -445,21 +674,25 @@
       <w:r>
         <w:t xml:space="preserve"> </w:t>
       </w:r>
+      <w:proofErr w:type="spellStart"/>
       <w:r>
         <w:rPr>
           <w:lang w:val="en-US"/>
         </w:rPr>
         <w:t>venv</w:t>
       </w:r>
+      <w:proofErr w:type="spellEnd"/>
       <w:r>
         <w:t xml:space="preserve"> </w:t>
       </w:r>
+      <w:proofErr w:type="spellStart"/>
       <w:r>
         <w:rPr>
           <w:lang w:val="en-US"/>
         </w:rPr>
         <w:t>venv</w:t>
       </w:r>
+      <w:proofErr w:type="spellEnd"/>
     </w:p>
     <w:p/>
     <w:p>
@@ -473,12 +706,28 @@
           <w:lang w:val="en-US"/>
         </w:rPr>
       </w:pPr>
-      <w:r>
-        <w:rPr>
-          <w:lang w:val="en-US"/>
-        </w:rPr>
-        <w:t>.\venv\Scripts\activate</w:t>
-      </w:r>
+      <w:proofErr w:type="gramStart"/>
+      <w:r>
+        <w:rPr>
+          <w:lang w:val="en-US"/>
+        </w:rPr>
+        <w:t>.\</w:t>
+      </w:r>
+      <w:proofErr w:type="spellStart"/>
+      <w:r>
+        <w:rPr>
+          <w:lang w:val="en-US"/>
+        </w:rPr>
+        <w:t>venv</w:t>
+      </w:r>
+      <w:proofErr w:type="spellEnd"/>
+      <w:r>
+        <w:rPr>
+          <w:lang w:val="en-US"/>
+        </w:rPr>
+        <w:t>\Scripts\activate</w:t>
+      </w:r>
+      <w:proofErr w:type="gramEnd"/>
     </w:p>
     <w:p>
       <w:pPr>
@@ -497,7 +746,21 @@
         <w:rPr>
           <w:lang w:val="en-US"/>
         </w:rPr>
-        <w:t># Обновите pip</w:t>
+        <w:t xml:space="preserve"># </w:t>
+      </w:r>
+      <w:proofErr w:type="spellStart"/>
+      <w:r>
+        <w:rPr>
+          <w:lang w:val="en-US"/>
+        </w:rPr>
+        <w:t>Обновите</w:t>
+      </w:r>
+      <w:proofErr w:type="spellEnd"/>
+      <w:r>
+        <w:rPr>
+          <w:lang w:val="en-US"/>
+        </w:rPr>
+        <w:t xml:space="preserve"> pip</w:t>
       </w:r>
     </w:p>
     <w:p>
@@ -611,6 +874,7 @@
       <w:r>
         <w:t xml:space="preserve"> </w:t>
       </w:r>
+      <w:proofErr w:type="gramStart"/>
       <w:r>
         <w:rPr>
           <w:lang w:val="en-US"/>
@@ -618,7 +882,11 @@
         <w:t>flask</w:t>
       </w:r>
       <w:r>
-        <w:t xml:space="preserve">  # или другие нужные пакеты</w:t>
+        <w:t xml:space="preserve">  #</w:t>
+      </w:r>
+      <w:proofErr w:type="gramEnd"/>
+      <w:r>
+        <w:t xml:space="preserve"> или другие нужные пакеты</w:t>
       </w:r>
     </w:p>
     <w:p/>
@@ -646,12 +914,14 @@
       <w:r>
         <w:t>.</w:t>
       </w:r>
+      <w:proofErr w:type="spellStart"/>
       <w:r>
         <w:rPr>
           <w:lang w:val="en-US"/>
         </w:rPr>
         <w:t>py</w:t>
       </w:r>
+      <w:proofErr w:type="spellEnd"/>
     </w:p>
     <w:p>
       <w:r>
@@ -713,7 +983,205 @@
           <w:bCs/>
           <w:u w:val="single"/>
         </w:rPr>
-        <w:t>Было проведено разделение в проекте cart.php gj flhtce mobileshop\pages на файлы  в папке mobileshop\pages\cart. После разделения В корзине при удалении появляется уведомление (Удалить товар из корзины?) после подтверждения оно появляется второй раз. Проанализируй страницы которые я предоставил, а также реши описанную проблему, а также следующую:</w:t>
+        <w:t xml:space="preserve">Было проведено разделение в проекте </w:t>
+      </w:r>
+      <w:proofErr w:type="spellStart"/>
+      <w:r>
+        <w:rPr>
+          <w:b/>
+          <w:bCs/>
+          <w:u w:val="single"/>
+        </w:rPr>
+        <w:t>cart.php</w:t>
+      </w:r>
+      <w:proofErr w:type="spellEnd"/>
+      <w:r>
+        <w:rPr>
+          <w:b/>
+          <w:bCs/>
+          <w:u w:val="single"/>
+        </w:rPr>
+        <w:t xml:space="preserve"> </w:t>
+      </w:r>
+      <w:proofErr w:type="spellStart"/>
+      <w:r>
+        <w:rPr>
+          <w:b/>
+          <w:bCs/>
+          <w:u w:val="single"/>
+        </w:rPr>
+        <w:t>gj</w:t>
+      </w:r>
+      <w:proofErr w:type="spellEnd"/>
+      <w:r>
+        <w:rPr>
+          <w:b/>
+          <w:bCs/>
+          <w:u w:val="single"/>
+        </w:rPr>
+        <w:t xml:space="preserve"> </w:t>
+      </w:r>
+      <w:proofErr w:type="spellStart"/>
+      <w:r>
+        <w:rPr>
+          <w:b/>
+          <w:bCs/>
+          <w:u w:val="single"/>
+        </w:rPr>
+        <w:t>flhtce</w:t>
+      </w:r>
+      <w:proofErr w:type="spellEnd"/>
+      <w:r>
+        <w:rPr>
+          <w:b/>
+          <w:bCs/>
+          <w:u w:val="single"/>
+        </w:rPr>
+        <w:t xml:space="preserve"> </w:t>
+      </w:r>
+      <w:proofErr w:type="spellStart"/>
+      <w:r>
+        <w:rPr>
+          <w:b/>
+          <w:bCs/>
+          <w:u w:val="single"/>
+        </w:rPr>
+        <w:t>mobileshop</w:t>
+      </w:r>
+      <w:proofErr w:type="spellEnd"/>
+      <w:r>
+        <w:rPr>
+          <w:b/>
+          <w:bCs/>
+          <w:u w:val="single"/>
+        </w:rPr>
+        <w:t>\</w:t>
+      </w:r>
+      <w:proofErr w:type="spellStart"/>
+      <w:r>
+        <w:rPr>
+          <w:b/>
+          <w:bCs/>
+          <w:u w:val="single"/>
+        </w:rPr>
+        <w:t>pages</w:t>
+      </w:r>
+      <w:proofErr w:type="spellEnd"/>
+      <w:r>
+        <w:rPr>
+          <w:b/>
+          <w:bCs/>
+          <w:u w:val="single"/>
+        </w:rPr>
+        <w:t xml:space="preserve"> на </w:t>
+      </w:r>
+      <w:proofErr w:type="gramStart"/>
+      <w:r>
+        <w:rPr>
+          <w:b/>
+          <w:bCs/>
+          <w:u w:val="single"/>
+        </w:rPr>
+        <w:t>файлы  в</w:t>
+      </w:r>
+      <w:proofErr w:type="gramEnd"/>
+      <w:r>
+        <w:rPr>
+          <w:b/>
+          <w:bCs/>
+          <w:u w:val="single"/>
+        </w:rPr>
+        <w:t xml:space="preserve"> папке </w:t>
+      </w:r>
+      <w:proofErr w:type="spellStart"/>
+      <w:r>
+        <w:rPr>
+          <w:b/>
+          <w:bCs/>
+          <w:u w:val="single"/>
+        </w:rPr>
+        <w:t>mobileshop</w:t>
+      </w:r>
+      <w:proofErr w:type="spellEnd"/>
+      <w:r>
+        <w:rPr>
+          <w:b/>
+          <w:bCs/>
+          <w:u w:val="single"/>
+        </w:rPr>
+        <w:t>\</w:t>
+      </w:r>
+      <w:proofErr w:type="spellStart"/>
+      <w:r>
+        <w:rPr>
+          <w:b/>
+          <w:bCs/>
+          <w:u w:val="single"/>
+        </w:rPr>
+        <w:t>pages</w:t>
+      </w:r>
+      <w:proofErr w:type="spellEnd"/>
+      <w:r>
+        <w:rPr>
+          <w:b/>
+          <w:bCs/>
+          <w:u w:val="single"/>
+        </w:rPr>
+        <w:t>\</w:t>
+      </w:r>
+      <w:proofErr w:type="spellStart"/>
+      <w:r>
+        <w:rPr>
+          <w:b/>
+          <w:bCs/>
+          <w:u w:val="single"/>
+        </w:rPr>
+        <w:t>cart</w:t>
+      </w:r>
+      <w:proofErr w:type="spellEnd"/>
+      <w:r>
+        <w:rPr>
+          <w:b/>
+          <w:bCs/>
+          <w:u w:val="single"/>
+        </w:rPr>
+        <w:t xml:space="preserve">. После </w:t>
+      </w:r>
+      <w:proofErr w:type="gramStart"/>
+      <w:r>
+        <w:rPr>
+          <w:b/>
+          <w:bCs/>
+          <w:u w:val="single"/>
+        </w:rPr>
+        <w:t>разделения</w:t>
+      </w:r>
+      <w:proofErr w:type="gramEnd"/>
+      <w:r>
+        <w:rPr>
+          <w:b/>
+          <w:bCs/>
+          <w:u w:val="single"/>
+        </w:rPr>
+        <w:t xml:space="preserve"> В корзине при удалении появляется уведомление (Удалить товар из корзины?) после подтверждения оно появляется второй раз. Проанализируй </w:t>
+      </w:r>
+      <w:proofErr w:type="gramStart"/>
+      <w:r>
+        <w:rPr>
+          <w:b/>
+          <w:bCs/>
+          <w:u w:val="single"/>
+        </w:rPr>
+        <w:t>страницы</w:t>
+      </w:r>
+      <w:proofErr w:type="gramEnd"/>
+      <w:r>
+        <w:rPr>
+          <w:b/>
+          <w:bCs/>
+          <w:u w:val="single"/>
+        </w:rPr>
+        <w:t xml:space="preserve"> которые я предоставил, а также реши описанную проблему, а также следующую:</w:t>
       </w:r>
     </w:p>
     <w:p>
@@ -731,7 +1199,46 @@
           <w:bCs/>
           <w:u w:val="single"/>
         </w:rPr>
-        <w:t>При переходе в корзину не авторизованным пользователем gjzdkztncz jib,rf/</w:t>
+        <w:lastRenderedPageBreak/>
+        <w:t xml:space="preserve">При переходе в корзину не авторизованным пользователем </w:t>
+      </w:r>
+      <w:proofErr w:type="spellStart"/>
+      <w:r>
+        <w:rPr>
+          <w:b/>
+          <w:bCs/>
+          <w:u w:val="single"/>
+        </w:rPr>
+        <w:t>gjzdkztncz</w:t>
+      </w:r>
+      <w:proofErr w:type="spellEnd"/>
+      <w:r>
+        <w:rPr>
+          <w:b/>
+          <w:bCs/>
+          <w:u w:val="single"/>
+        </w:rPr>
+        <w:t xml:space="preserve"> </w:t>
+      </w:r>
+      <w:proofErr w:type="spellStart"/>
+      <w:proofErr w:type="gramStart"/>
+      <w:r>
+        <w:rPr>
+          <w:b/>
+          <w:bCs/>
+          <w:u w:val="single"/>
+        </w:rPr>
+        <w:t>jib,rf</w:t>
+      </w:r>
+      <w:proofErr w:type="spellEnd"/>
+      <w:proofErr w:type="gramEnd"/>
+      <w:r>
+        <w:rPr>
+          <w:b/>
+          <w:bCs/>
+          <w:u w:val="single"/>
+        </w:rPr>
+        <w:t>/</w:t>
       </w:r>
     </w:p>
     <w:p>
@@ -761,7 +1268,247 @@
           <w:u w:val="single"/>
           <w:lang w:val="en-US"/>
         </w:rPr>
-        <w:t>Fatal error: Uncaught ArgumentCountError: The number of elements in the type definition string must match the number of bind variables in C:\xampp\htdocs\mobileshop\pages\cart\GuestCartService.php:246 Stack trace: #0 C:\xampp\htdocs\mobileshop\pages\cart\GuestCartService.php(246): mysqli_stmt-&gt;bind_param('iiii', 45, 45, 45) #1 C:\xampp\htdocs\mobileshop\pages\cart\GuestCartService.php(109): GuestCartService-&gt;getItemDetails(45, 45) #2 C:\xampp\htdocs\mobileshop\pages\cart\CartController.php(143): GuestCartService-&gt;getCartItems() #3 C:\xampp\htdocs\mobileshop\pages\cart\CartController.php(37): CartController-&gt;renderCart() #4 C:\xampp\htdocs\mobileshop\pages\cart\cart.php(23): CartController-&gt;handleRequest() #5 {main} thrown in C:\xampp\htdocs\mobileshop\pages\cart\GuestCartService.php on line 246.</w:t>
+        <w:t xml:space="preserve">Fatal error: Uncaught </w:t>
+      </w:r>
+      <w:proofErr w:type="spellStart"/>
+      <w:r>
+        <w:rPr>
+          <w:b/>
+          <w:bCs/>
+          <w:u w:val="single"/>
+          <w:lang w:val="en-US"/>
+        </w:rPr>
+        <w:t>ArgumentCountError</w:t>
+      </w:r>
+      <w:proofErr w:type="spellEnd"/>
+      <w:r>
+        <w:rPr>
+          <w:b/>
+          <w:bCs/>
+          <w:u w:val="single"/>
+          <w:lang w:val="en-US"/>
+        </w:rPr>
+        <w:t xml:space="preserve">: The number of elements in the type definition string must match the number of bind variables in C:\xampp\htdocs\mobileshop\pages\cart\GuestCartService.php:246 Stack trace: #0 C:\xampp\htdocs\mobileshop\pages\cart\GuestCartService.php(246): </w:t>
+      </w:r>
+      <w:proofErr w:type="spellStart"/>
+      <w:r>
+        <w:rPr>
+          <w:b/>
+          <w:bCs/>
+          <w:u w:val="single"/>
+          <w:lang w:val="en-US"/>
+        </w:rPr>
+        <w:t>mysqli_stmt</w:t>
+      </w:r>
+      <w:proofErr w:type="spellEnd"/>
+      <w:r>
+        <w:rPr>
+          <w:b/>
+          <w:bCs/>
+          <w:u w:val="single"/>
+          <w:lang w:val="en-US"/>
+        </w:rPr>
+        <w:t>-&gt;</w:t>
+      </w:r>
+      <w:proofErr w:type="spellStart"/>
+      <w:r>
+        <w:rPr>
+          <w:b/>
+          <w:bCs/>
+          <w:u w:val="single"/>
+          <w:lang w:val="en-US"/>
+        </w:rPr>
+        <w:t>bind_param</w:t>
+      </w:r>
+      <w:proofErr w:type="spellEnd"/>
+      <w:r>
+        <w:rPr>
+          <w:b/>
+          <w:bCs/>
+          <w:u w:val="single"/>
+          <w:lang w:val="en-US"/>
+        </w:rPr>
+        <w:t>('</w:t>
+      </w:r>
+      <w:proofErr w:type="spellStart"/>
+      <w:r>
+        <w:rPr>
+          <w:b/>
+          <w:bCs/>
+          <w:u w:val="single"/>
+          <w:lang w:val="en-US"/>
+        </w:rPr>
+        <w:t>iiii</w:t>
+      </w:r>
+      <w:proofErr w:type="spellEnd"/>
+      <w:r>
+        <w:rPr>
+          <w:b/>
+          <w:bCs/>
+          <w:u w:val="single"/>
+          <w:lang w:val="en-US"/>
+        </w:rPr>
+        <w:t xml:space="preserve">', 45, 45, 45) #1 C:\xampp\htdocs\mobileshop\pages\cart\GuestCartService.php(109): </w:t>
+      </w:r>
+      <w:proofErr w:type="spellStart"/>
+      <w:r>
+        <w:rPr>
+          <w:b/>
+          <w:bCs/>
+          <w:u w:val="single"/>
+          <w:lang w:val="en-US"/>
+        </w:rPr>
+        <w:t>GuestCartService</w:t>
+      </w:r>
+      <w:proofErr w:type="spellEnd"/>
+      <w:r>
+        <w:rPr>
+          <w:b/>
+          <w:bCs/>
+          <w:u w:val="single"/>
+          <w:lang w:val="en-US"/>
+        </w:rPr>
+        <w:t>-&gt;</w:t>
+      </w:r>
+      <w:proofErr w:type="spellStart"/>
+      <w:r>
+        <w:rPr>
+          <w:b/>
+          <w:bCs/>
+          <w:u w:val="single"/>
+          <w:lang w:val="en-US"/>
+        </w:rPr>
+        <w:t>getItemDetails</w:t>
+      </w:r>
+      <w:proofErr w:type="spellEnd"/>
+      <w:r>
+        <w:rPr>
+          <w:b/>
+          <w:bCs/>
+          <w:u w:val="single"/>
+          <w:lang w:val="en-US"/>
+        </w:rPr>
+        <w:t xml:space="preserve">(45, 45) #2 C:\xampp\htdocs\mobileshop\pages\cart\CartController.php(143): </w:t>
+      </w:r>
+      <w:proofErr w:type="spellStart"/>
+      <w:r>
+        <w:rPr>
+          <w:b/>
+          <w:bCs/>
+          <w:u w:val="single"/>
+          <w:lang w:val="en-US"/>
+        </w:rPr>
+        <w:t>GuestCartService</w:t>
+      </w:r>
+      <w:proofErr w:type="spellEnd"/>
+      <w:r>
+        <w:rPr>
+          <w:b/>
+          <w:bCs/>
+          <w:u w:val="single"/>
+          <w:lang w:val="en-US"/>
+        </w:rPr>
+        <w:t>-&gt;</w:t>
+      </w:r>
+      <w:proofErr w:type="spellStart"/>
+      <w:r>
+        <w:rPr>
+          <w:b/>
+          <w:bCs/>
+          <w:u w:val="single"/>
+          <w:lang w:val="en-US"/>
+        </w:rPr>
+        <w:t>getCartItems</w:t>
+      </w:r>
+      <w:proofErr w:type="spellEnd"/>
+      <w:r>
+        <w:rPr>
+          <w:b/>
+          <w:bCs/>
+          <w:u w:val="single"/>
+          <w:lang w:val="en-US"/>
+        </w:rPr>
+        <w:t xml:space="preserve">() #3 C:\xampp\htdocs\mobileshop\pages\cart\CartController.php(37): </w:t>
+      </w:r>
+      <w:proofErr w:type="spellStart"/>
+      <w:r>
+        <w:rPr>
+          <w:b/>
+          <w:bCs/>
+          <w:u w:val="single"/>
+          <w:lang w:val="en-US"/>
+        </w:rPr>
+        <w:t>CartController</w:t>
+      </w:r>
+      <w:proofErr w:type="spellEnd"/>
+      <w:r>
+        <w:rPr>
+          <w:b/>
+          <w:bCs/>
+          <w:u w:val="single"/>
+          <w:lang w:val="en-US"/>
+        </w:rPr>
+        <w:t>-&gt;</w:t>
+      </w:r>
+      <w:proofErr w:type="spellStart"/>
+      <w:r>
+        <w:rPr>
+          <w:b/>
+          <w:bCs/>
+          <w:u w:val="single"/>
+          <w:lang w:val="en-US"/>
+        </w:rPr>
+        <w:t>renderCart</w:t>
+      </w:r>
+      <w:proofErr w:type="spellEnd"/>
+      <w:r>
+        <w:rPr>
+          <w:b/>
+          <w:bCs/>
+          <w:u w:val="single"/>
+          <w:lang w:val="en-US"/>
+        </w:rPr>
+        <w:t xml:space="preserve">() #4 C:\xampp\htdocs\mobileshop\pages\cart\cart.php(23): </w:t>
+      </w:r>
+      <w:proofErr w:type="spellStart"/>
+      <w:r>
+        <w:rPr>
+          <w:b/>
+          <w:bCs/>
+          <w:u w:val="single"/>
+          <w:lang w:val="en-US"/>
+        </w:rPr>
+        <w:t>CartController</w:t>
+      </w:r>
+      <w:proofErr w:type="spellEnd"/>
+      <w:r>
+        <w:rPr>
+          <w:b/>
+          <w:bCs/>
+          <w:u w:val="single"/>
+          <w:lang w:val="en-US"/>
+        </w:rPr>
+        <w:t>-&gt;</w:t>
+      </w:r>
+      <w:proofErr w:type="spellStart"/>
+      <w:r>
+        <w:rPr>
+          <w:b/>
+          <w:bCs/>
+          <w:u w:val="single"/>
+          <w:lang w:val="en-US"/>
+        </w:rPr>
+        <w:t>handleRequest</w:t>
+      </w:r>
+      <w:proofErr w:type="spellEnd"/>
+      <w:r>
+        <w:rPr>
+          <w:b/>
+          <w:bCs/>
+          <w:u w:val="single"/>
+          <w:lang w:val="en-US"/>
+        </w:rPr>
+        <w:t>() #5 {main} thrown in C:\xampp\htdocs\mobileshop\pages\cart\GuestCartService.php on line 246.</w:t>
       </w:r>
     </w:p>
     <w:p>
@@ -790,7 +1537,25 @@
           <w:bCs/>
           <w:u w:val="single"/>
         </w:rPr>
-        <w:t>Предоставленный результат анализа, и предложения по улучшению распиши по этапам в конце ответа. Также ты должен описать в каких файлах что нужно поменять после спросить подтверждения хочу ли я получить полностью переписанные файлы согласно пронумерованному твоему предложению. Если согласен вернуть полный файл который можно копировать и вставлять вместо оригинального.</w:t>
+        <w:t xml:space="preserve">Предоставленный результат анализа, и предложения по улучшению распиши по этапам в конце ответа. Также ты должен описать в каких файлах что нужно поменять после спросить подтверждения хочу ли я получить полностью переписанные файлы согласно пронумерованному твоему предложению. Если согласен вернуть </w:t>
+      </w:r>
+      <w:proofErr w:type="gramStart"/>
+      <w:r>
+        <w:rPr>
+          <w:b/>
+          <w:bCs/>
+          <w:u w:val="single"/>
+        </w:rPr>
+        <w:t>полный файл</w:t>
+      </w:r>
+      <w:proofErr w:type="gramEnd"/>
+      <w:r>
+        <w:rPr>
+          <w:b/>
+          <w:bCs/>
+          <w:u w:val="single"/>
+        </w:rPr>
+        <w:t xml:space="preserve"> который можно копировать и вставлять вместо оригинального.</w:t>
       </w:r>
     </w:p>
     <w:sectPr>

</xml_diff>